<commit_message>
[L3-Agent] Update '(end of document)' in OmniBridge_Low_Level_Document.docx — demo-user
</commit_message>
<xml_diff>
--- a/OmniBridgeDocs/OmniBridge_Low_Level_Document.docx
+++ b/OmniBridgeDocs/OmniBridge_Low_Level_Document.docx
@@ -3097,6 +3097,11 @@
           <w:szCs w:val="21"/>
         </w:rPr>
         <w:t xml:space="preserve">Every inbound request generates a correlation ID (or propagates one supplied via X-Correlation-Id header) that is attached to all downstream calls to Oracle Middleware and the MDM Hub, and included in all log lines, enabling end-to-end tracing of a single order or lookup across systems.</w:t>
+      </w:r>
+    </w:p>
+    <w:p>
+      <w:r>
+        <w:t>This is an end of line update TEST</w:t>
       </w:r>
     </w:p>
     <w:sectPr>

</xml_diff>